<commit_message>
fixing bug in auto update
</commit_message>
<xml_diff>
--- a/src/resources/documents/BatStateU-Notice-to-Proceed.docx
+++ b/src/resources/documents/BatStateU-Notice-to-Proceed.docx
@@ -4,25 +4,36 @@
   <w:body>
     <w:tbl>
       <w:tblPr>
-        <w:tblW w:type="auto" w:w="0"/>
+        <w:tblW w:type="dxa" w:w="10166"/>
         <w:jc w:val="center"/>
         <w:tblLayout w:type="fixed"/>
         <w:tblLook w:firstColumn="1" w:firstRow="1" w:lastColumn="0" w:lastRow="0" w:noHBand="0" w:noVBand="1" w:val="04A0"/>
+        <w:tblInd w:w="0" w:type="dxa"/>
+        <w:tblBorders>
+          <w:top w:val="nil"/>
+          <w:start w:val="nil"/>
+          <w:bottom w:val="nil"/>
+          <w:end w:val="nil"/>
+          <w:insideH w:val="nil"/>
+          <w:insideV w:val="nil"/>
+        </w:tblBorders>
       </w:tblPr>
       <w:tblGrid>
-        <w:gridCol w:w="1512"/>
-        <w:gridCol w:w="8568"/>
+        <w:gridCol w:w="1555"/>
+        <w:gridCol w:w="7056"/>
+        <w:gridCol w:w="1555"/>
       </w:tblGrid>
       <w:tr>
         <w:tc>
           <w:tcPr>
-            <w:tcW w:type="dxa" w:w="5083"/>
+            <w:tcW w:type="dxa" w:w="1555"/>
             <w:tcMar>
               <w:top w:w="0" w:type="dxa"/>
               <w:start w:w="0" w:type="dxa"/>
               <w:bottom w:w="0" w:type="dxa"/>
-              <w:end w:w="45" w:type="dxa"/>
+              <w:end w:w="0" w:type="dxa"/>
             </w:tcMar>
+            <w:vAlign w:val="center"/>
           </w:tcPr>
           <w:p>
             <w:pPr>
@@ -67,24 +78,25 @@
         </w:tc>
         <w:tc>
           <w:tcPr>
-            <w:tcW w:type="dxa" w:w="5083"/>
+            <w:tcW w:type="dxa" w:w="7056"/>
             <w:tcMar>
               <w:top w:w="0" w:type="dxa"/>
               <w:start w:w="0" w:type="dxa"/>
               <w:bottom w:w="0" w:type="dxa"/>
               <w:end w:w="0" w:type="dxa"/>
             </w:tcMar>
+            <w:vAlign w:val="center"/>
           </w:tcPr>
           <w:p>
             <w:pPr>
-              <w:spacing w:after="0" w:line="216" w:lineRule="auto"/>
+              <w:spacing w:after="0" w:line="240" w:lineRule="auto" w:before="0"/>
               <w:jc w:val="center"/>
             </w:pPr>
             <w:r/>
             <w:r>
               <w:rPr>
                 <w:rFonts w:ascii="Arial" w:hAnsi="Arial" w:eastAsia="Arial"/>
-                <w:b w:val="0"/>
+                <w:b/>
                 <w:i w:val="0"/>
                 <w:color w:val="161616"/>
                 <w:sz w:val="16"/>
@@ -94,7 +106,7 @@
           </w:p>
           <w:p>
             <w:pPr>
-              <w:spacing w:after="0" w:line="216" w:lineRule="auto"/>
+              <w:spacing w:after="0" w:line="240" w:lineRule="auto" w:before="0"/>
               <w:jc w:val="center"/>
             </w:pPr>
             <w:r>
@@ -103,14 +115,14 @@
                 <w:b/>
                 <w:i w:val="0"/>
                 <w:color w:val="161616"/>
-                <w:sz w:val="22"/>
+                <w:sz w:val="28"/>
               </w:rPr>
               <w:t>BATANGAS STATE UNIVERSITY</w:t>
             </w:r>
           </w:p>
           <w:p>
             <w:pPr>
-              <w:spacing w:after="0" w:line="216" w:lineRule="auto"/>
+              <w:spacing w:after="0" w:line="240" w:lineRule="auto" w:before="0"/>
               <w:jc w:val="center"/>
             </w:pPr>
             <w:r>
@@ -119,14 +131,30 @@
                 <w:b/>
                 <w:i w:val="0"/>
                 <w:color w:val="C8102E"/>
-                <w:sz w:val="17"/>
+                <w:sz w:val="20"/>
               </w:rPr>
               <w:t>The National Engineering University</w:t>
             </w:r>
           </w:p>
           <w:p>
             <w:pPr>
-              <w:spacing w:after="0" w:line="216" w:lineRule="auto"/>
+              <w:spacing w:after="0" w:line="240" w:lineRule="auto" w:before="0"/>
+              <w:jc w:val="center"/>
+            </w:pPr>
+            <w:r>
+              <w:rPr>
+                <w:rFonts w:ascii="Arial" w:hAnsi="Arial" w:eastAsia="Arial"/>
+                <w:b/>
+                <w:i w:val="0"/>
+                <w:color w:val="161616"/>
+                <w:sz w:val="20"/>
+              </w:rPr>
+              <w:t>ARASOF-Nasugbu Campus</w:t>
+            </w:r>
+          </w:p>
+          <w:p>
+            <w:pPr>
+              <w:spacing w:after="0" w:line="240" w:lineRule="auto" w:before="0"/>
               <w:jc w:val="center"/>
             </w:pPr>
             <w:r>
@@ -137,12 +165,12 @@
                 <w:color w:val="161616"/>
                 <w:sz w:val="17"/>
               </w:rPr>
-              <w:t>ARASOF-Nasugbu Campus</w:t>
+              <w:t>R. Martinez St., Brgy. Bucana, Nasugbu, Batangas, Philippines 4231</w:t>
             </w:r>
           </w:p>
           <w:p>
             <w:pPr>
-              <w:spacing w:after="0" w:line="216" w:lineRule="auto"/>
+              <w:spacing w:after="0" w:line="240" w:lineRule="auto" w:before="0"/>
               <w:jc w:val="center"/>
             </w:pPr>
             <w:r>
@@ -151,39 +179,50 @@
                 <w:b w:val="0"/>
                 <w:i w:val="0"/>
                 <w:color w:val="161616"/>
-                <w:sz w:val="15"/>
+                <w:sz w:val="17"/>
               </w:rPr>
-              <w:t>R. Martinez St., Brgy. Bucana, Nasugbu, Batangas, Philippines 4231</w:t>
+              <w:t>Tel Nos.: +63 43 416 0350 local 302</w:t>
             </w:r>
           </w:p>
+        </w:tc>
+        <w:tc>
+          <w:tcPr>
+            <w:tcW w:type="dxa" w:w="1555"/>
+            <w:vAlign w:val="center"/>
+            <w:tcMar>
+              <w:top w:w="0" w:type="dxa"/>
+              <w:start w:w="0" w:type="dxa"/>
+              <w:bottom w:w="0" w:type="dxa"/>
+              <w:end w:w="0" w:type="dxa"/>
+            </w:tcMar>
+          </w:tcPr>
+          <w:p/>
+        </w:tc>
+      </w:tr>
+      <w:tr>
+        <w:tc>
+          <w:tcPr>
+            <w:tcW w:type="dxa" w:w="10166"/>
+            <w:gridSpan w:val="3"/>
+            <w:tcMar>
+              <w:top w:w="0" w:type="dxa"/>
+              <w:start w:w="0" w:type="dxa"/>
+              <w:bottom w:w="15" w:type="dxa"/>
+              <w:end w:w="0" w:type="dxa"/>
+            </w:tcMar>
+          </w:tcPr>
           <w:p>
             <w:pPr>
-              <w:spacing w:after="0" w:line="216" w:lineRule="auto"/>
+              <w:spacing w:before="0" w:after="0" w:line="240" w:lineRule="auto"/>
               <w:jc w:val="center"/>
             </w:pPr>
             <w:r>
               <w:rPr>
-                <w:rFonts w:ascii="Arial" w:hAnsi="Arial" w:eastAsia="Arial"/>
+                <w:rFonts w:ascii="Arial" w:hAnsi="Arial"/>
                 <w:b w:val="0"/>
                 <w:i w:val="0"/>
                 <w:color w:val="161616"/>
-                <w:sz w:val="15"/>
-              </w:rPr>
-              <w:t>Tel Nos.: +63 43 416 0350 local 302</w:t>
-            </w:r>
-          </w:p>
-          <w:p>
-            <w:pPr>
-              <w:spacing w:after="0" w:line="216" w:lineRule="auto"/>
-              <w:jc w:val="center"/>
-            </w:pPr>
-            <w:r>
-              <w:rPr>
-                <w:rFonts w:ascii="Arial" w:hAnsi="Arial" w:eastAsia="Arial"/>
-                <w:b w:val="0"/>
-                <w:i w:val="0"/>
-                <w:color w:val="161616"/>
-                <w:sz w:val="14"/>
+                <w:sz w:val="16"/>
               </w:rPr>
               <w:t>E-mail Address: research.nasugbu@g.batstate-u.edu.ph  |  Website Address: www.batstate-u.edu.ph</w:t>
             </w:r>
@@ -193,16 +232,17 @@
     </w:tbl>
     <w:p>
       <w:pPr>
-        <w:spacing w:before="20" w:after="20"/>
+        <w:spacing w:before="20" w:after="20" w:line="240" w:lineRule="auto"/>
         <w:pBdr>
-          <w:bottom w:val="single" w:sz="10" w:space="1" w:color="C8102E"/>
+          <w:bottom w:val="single" w:sz="14" w:space="0" w:color="000000"/>
         </w:pBdr>
+        <w:ind w:left="-820" w:right="-820"/>
       </w:pPr>
     </w:p>
     <w:p>
       <w:pPr>
-        <w:spacing w:after="140"/>
-        <w:jc w:val="center"/>
+        <w:spacing w:after="140" w:before="0"/>
+        <w:jc w:val="left"/>
       </w:pPr>
       <w:r>
         <w:rPr>
@@ -333,18 +373,58 @@
     <w:p>
       <w:pPr>
         <w:widowControl/>
-        <w:spacing w:after="100" w:line="240" w:lineRule="auto"/>
+        <w:spacing w:after="100" w:line="240" w:lineRule="auto" w:before="0"/>
         <w:jc w:val="both"/>
       </w:pPr>
       <w:r>
         <w:rPr>
-          <w:rFonts w:ascii="Times New Roman" w:hAnsi="Times New Roman" w:eastAsia="Times New Roman"/>
+          <w:rFonts w:ascii="Times New Roman" w:hAnsi="Times New Roman"/>
           <w:b w:val="0"/>
           <w:i w:val="0"/>
           <w:color w:val="161616"/>
           <w:sz w:val="18"/>
         </w:rPr>
-        <w:t>Based on the Local Research Evaluation Committee (LREC) Resolution No. {{RESOLUTION_NUMBER}}, S. {{RESOLUTION_YEAR}}, the approved duration of the project is {{DURATION_WORDS}} ({{DURATION_MONTHS}}) {{DURATION_UNIT}} which shall commence from {{START_DATE}} to {{END_DATE}}, with a budget amounting to {{BUDGET_WORDS}} (Php {{BUDGET_AMOUNT}}) only. You are required to present monthly actual accomplishments to the assigned research monitoring personnel and submit quarterly monitoring reports to the Research Office of ARASOF-Nasugbu Campus during the conduct of this project.</w:t>
+        <w:t xml:space="preserve">Based on the Local Research Evaluation Committee (LREC) Resolution No. {{RESOLUTION_NUMBER}}, S. {{RESOLUTION_YEAR}}, the approved duration of the project is {{DURATION_WORDS}} ({{DURATION_MONTHS}}) {{DURATION_UNIT}} which shall commence from </w:t>
+      </w:r>
+      <w:r>
+        <w:rPr>
+          <w:rFonts w:ascii="Times New Roman" w:hAnsi="Times New Roman"/>
+          <w:b/>
+          <w:i w:val="0"/>
+          <w:color w:val="161616"/>
+          <w:sz w:val="18"/>
+        </w:rPr>
+        <w:t>{{START_DATE}} to {{END_DATE}}</w:t>
+      </w:r>
+      <w:r>
+        <w:rPr>
+          <w:rFonts w:ascii="Times New Roman" w:hAnsi="Times New Roman"/>
+          <w:b w:val="0"/>
+          <w:i w:val="0"/>
+          <w:color w:val="161616"/>
+          <w:sz w:val="18"/>
+        </w:rPr>
+        <w:t xml:space="preserve">, with a budget amounting to </w:t>
+      </w:r>
+      <w:r>
+        <w:rPr>
+          <w:rFonts w:ascii="Times New Roman" w:hAnsi="Times New Roman"/>
+          <w:b/>
+          <w:i w:val="0"/>
+          <w:color w:val="161616"/>
+          <w:sz w:val="18"/>
+        </w:rPr>
+        <w:t>{{BUDGET_WORDS}} (Php {{BUDGET_AMOUNT}})</w:t>
+      </w:r>
+      <w:r>
+        <w:rPr>
+          <w:rFonts w:ascii="Times New Roman" w:hAnsi="Times New Roman"/>
+          <w:b w:val="0"/>
+          <w:i w:val="0"/>
+          <w:color w:val="161616"/>
+          <w:sz w:val="18"/>
+        </w:rPr>
+        <w:t xml:space="preserve"> only. You are required to present monthly actual accomplishments to the assigned research monitoring personnel and submit quarterly monitoring reports to the Research Office of ARASOF-Nasugbu Campus during the conduct of this project.</w:t>
       </w:r>
     </w:p>
     <w:p>
@@ -366,23 +446,26 @@
     </w:p>
     <w:tbl>
       <w:tblPr>
-        <w:tblW w:type="auto" w:w="0"/>
-        <w:jc w:val="center"/>
+        <w:tblW w:type="dxa" w:w="10166"/>
         <w:tblLayout w:type="fixed"/>
         <w:tblLook w:firstColumn="1" w:firstRow="1" w:lastColumn="0" w:lastRow="0" w:noHBand="0" w:noVBand="1" w:val="04A0"/>
+        <w:jc w:val="center"/>
         <w:tblBorders>
-          <w:top w:val="single" w:sz="5" w:color="777777"/>
+          <w:top w:val="single" w:sz="4" w:color="000000" w:space="0"/>
           <w:left w:val="single" w:sz="5" w:color="777777"/>
-          <w:bottom w:val="single" w:sz="5" w:color="777777"/>
+          <w:bottom w:val="single" w:sz="4" w:color="000000" w:space="0"/>
           <w:right w:val="single" w:sz="5" w:color="777777"/>
-          <w:insideH w:val="single" w:sz="5" w:color="777777"/>
-          <w:insideV w:val="single" w:sz="5" w:color="777777"/>
+          <w:insideH w:val="single" w:sz="4" w:color="000000" w:space="0"/>
+          <w:insideV w:val="single" w:sz="4" w:color="000000" w:space="0"/>
+          <w:start w:val="single" w:sz="4" w:space="0" w:color="000000"/>
+          <w:end w:val="single" w:sz="4" w:space="0" w:color="000000"/>
         </w:tblBorders>
+        <w:tblInd w:w="0" w:type="dxa"/>
       </w:tblPr>
       <w:tblGrid>
-        <w:gridCol w:w="3389"/>
-        <w:gridCol w:w="3389"/>
-        <w:gridCol w:w="3389"/>
+        <w:gridCol w:w="3240"/>
+        <w:gridCol w:w="3100"/>
+        <w:gridCol w:w="3826"/>
       </w:tblGrid>
       <w:tr>
         <w:trPr>
@@ -390,19 +473,18 @@
         </w:trPr>
         <w:tc>
           <w:tcPr>
-            <w:tcW w:type="dxa" w:w="3283"/>
-            <w:shd w:fill="EFEFEF"/>
+            <w:tcW w:type="dxa" w:w="3240"/>
             <w:vAlign w:val="center"/>
             <w:tcMar>
-              <w:top w:w="55" w:type="dxa"/>
-              <w:start w:w="55" w:type="dxa"/>
-              <w:bottom w:w="55" w:type="dxa"/>
-              <w:end w:w="55" w:type="dxa"/>
+              <w:top w:w="25" w:type="dxa"/>
+              <w:start w:w="45" w:type="dxa"/>
+              <w:bottom w:w="25" w:type="dxa"/>
+              <w:end w:w="45" w:type="dxa"/>
             </w:tcMar>
           </w:tcPr>
           <w:p>
             <w:pPr>
-              <w:spacing w:after="0" w:line="240" w:lineRule="auto"/>
+              <w:spacing w:after="0" w:line="240" w:lineRule="auto" w:before="0"/>
               <w:jc w:val="center"/>
             </w:pPr>
             <w:r/>
@@ -412,7 +494,7 @@
                 <w:b/>
                 <w:i w:val="0"/>
                 <w:color w:val="161616"/>
-                <w:sz w:val="15"/>
+                <w:sz w:val="16"/>
               </w:rPr>
               <w:t>Classification of Researcher</w:t>
             </w:r>
@@ -420,19 +502,18 @@
         </w:tc>
         <w:tc>
           <w:tcPr>
-            <w:tcW w:type="dxa" w:w="3240"/>
-            <w:shd w:fill="EFEFEF"/>
+            <w:tcW w:type="dxa" w:w="3100"/>
             <w:vAlign w:val="center"/>
             <w:tcMar>
-              <w:top w:w="55" w:type="dxa"/>
-              <w:start w:w="55" w:type="dxa"/>
-              <w:bottom w:w="55" w:type="dxa"/>
-              <w:end w:w="55" w:type="dxa"/>
+              <w:top w:w="25" w:type="dxa"/>
+              <w:start w:w="45" w:type="dxa"/>
+              <w:bottom w:w="25" w:type="dxa"/>
+              <w:end w:w="45" w:type="dxa"/>
             </w:tcMar>
           </w:tcPr>
           <w:p>
             <w:pPr>
-              <w:spacing w:after="0" w:line="240" w:lineRule="auto"/>
+              <w:spacing w:after="0" w:line="240" w:lineRule="auto" w:before="0"/>
               <w:jc w:val="center"/>
             </w:pPr>
             <w:r/>
@@ -442,7 +523,7 @@
                 <w:b/>
                 <w:i w:val="0"/>
                 <w:color w:val="161616"/>
-                <w:sz w:val="15"/>
+                <w:sz w:val="16"/>
               </w:rPr>
               <w:t>Reduction of Teaching Load</w:t>
             </w:r>
@@ -450,19 +531,18 @@
         </w:tc>
         <w:tc>
           <w:tcPr>
-            <w:tcW w:type="dxa" w:w="3557"/>
-            <w:shd w:fill="EFEFEF"/>
+            <w:tcW w:type="dxa" w:w="3826"/>
             <w:vAlign w:val="center"/>
             <w:tcMar>
-              <w:top w:w="55" w:type="dxa"/>
-              <w:start w:w="55" w:type="dxa"/>
-              <w:bottom w:w="55" w:type="dxa"/>
-              <w:end w:w="55" w:type="dxa"/>
+              <w:top w:w="25" w:type="dxa"/>
+              <w:start w:w="45" w:type="dxa"/>
+              <w:bottom w:w="25" w:type="dxa"/>
+              <w:end w:w="45" w:type="dxa"/>
             </w:tcMar>
           </w:tcPr>
           <w:p>
             <w:pPr>
-              <w:spacing w:after="0" w:line="240" w:lineRule="auto"/>
+              <w:spacing w:after="0" w:line="240" w:lineRule="auto" w:before="0"/>
               <w:jc w:val="center"/>
             </w:pPr>
             <w:r/>
@@ -472,7 +552,7 @@
                 <w:b/>
                 <w:i w:val="0"/>
                 <w:color w:val="161616"/>
-                <w:sz w:val="15"/>
+                <w:sz w:val="16"/>
               </w:rPr>
               <w:t>Number of Hours to be Rendered Weekly in the Conduct of Research</w:t>
             </w:r>
@@ -482,18 +562,18 @@
       <w:tr>
         <w:tc>
           <w:tcPr>
-            <w:tcW w:type="dxa" w:w="3283"/>
+            <w:tcW w:type="dxa" w:w="3240"/>
             <w:vAlign w:val="center"/>
             <w:tcMar>
-              <w:top w:w="55" w:type="dxa"/>
-              <w:start w:w="55" w:type="dxa"/>
-              <w:bottom w:w="55" w:type="dxa"/>
-              <w:end w:w="55" w:type="dxa"/>
+              <w:top w:w="25" w:type="dxa"/>
+              <w:start w:w="45" w:type="dxa"/>
+              <w:bottom w:w="25" w:type="dxa"/>
+              <w:end w:w="45" w:type="dxa"/>
             </w:tcMar>
           </w:tcPr>
           <w:p>
             <w:pPr>
-              <w:spacing w:after="0" w:line="240" w:lineRule="auto"/>
+              <w:spacing w:after="0" w:line="240" w:lineRule="auto" w:before="0"/>
               <w:jc w:val="left"/>
             </w:pPr>
             <w:r/>
@@ -511,18 +591,18 @@
         </w:tc>
         <w:tc>
           <w:tcPr>
-            <w:tcW w:type="dxa" w:w="3240"/>
+            <w:tcW w:type="dxa" w:w="3100"/>
             <w:vAlign w:val="center"/>
             <w:tcMar>
-              <w:top w:w="55" w:type="dxa"/>
-              <w:start w:w="55" w:type="dxa"/>
-              <w:bottom w:w="55" w:type="dxa"/>
-              <w:end w:w="55" w:type="dxa"/>
+              <w:top w:w="25" w:type="dxa"/>
+              <w:start w:w="45" w:type="dxa"/>
+              <w:bottom w:w="25" w:type="dxa"/>
+              <w:end w:w="45" w:type="dxa"/>
             </w:tcMar>
           </w:tcPr>
           <w:p>
             <w:pPr>
-              <w:spacing w:after="0" w:line="240" w:lineRule="auto"/>
+              <w:spacing w:after="0" w:line="240" w:lineRule="auto" w:before="0"/>
               <w:jc w:val="center"/>
             </w:pPr>
             <w:r/>
@@ -540,18 +620,18 @@
         </w:tc>
         <w:tc>
           <w:tcPr>
-            <w:tcW w:type="dxa" w:w="3557"/>
+            <w:tcW w:type="dxa" w:w="3826"/>
             <w:vAlign w:val="center"/>
             <w:tcMar>
-              <w:top w:w="55" w:type="dxa"/>
-              <w:start w:w="55" w:type="dxa"/>
-              <w:bottom w:w="55" w:type="dxa"/>
-              <w:end w:w="55" w:type="dxa"/>
+              <w:top w:w="25" w:type="dxa"/>
+              <w:start w:w="45" w:type="dxa"/>
+              <w:bottom w:w="25" w:type="dxa"/>
+              <w:end w:w="45" w:type="dxa"/>
             </w:tcMar>
           </w:tcPr>
           <w:p>
             <w:pPr>
-              <w:spacing w:after="0" w:line="240" w:lineRule="auto"/>
+              <w:spacing w:after="0" w:line="240" w:lineRule="auto" w:before="0"/>
               <w:jc w:val="center"/>
             </w:pPr>
             <w:r/>
@@ -571,18 +651,18 @@
       <w:tr>
         <w:tc>
           <w:tcPr>
-            <w:tcW w:type="dxa" w:w="3283"/>
+            <w:tcW w:type="dxa" w:w="3240"/>
             <w:vAlign w:val="center"/>
             <w:tcMar>
-              <w:top w:w="55" w:type="dxa"/>
-              <w:start w:w="55" w:type="dxa"/>
-              <w:bottom w:w="55" w:type="dxa"/>
-              <w:end w:w="55" w:type="dxa"/>
+              <w:top w:w="25" w:type="dxa"/>
+              <w:start w:w="45" w:type="dxa"/>
+              <w:bottom w:w="25" w:type="dxa"/>
+              <w:end w:w="45" w:type="dxa"/>
             </w:tcMar>
           </w:tcPr>
           <w:p>
             <w:pPr>
-              <w:spacing w:after="0" w:line="240" w:lineRule="auto"/>
+              <w:spacing w:after="0" w:line="240" w:lineRule="auto" w:before="0"/>
               <w:jc w:val="left"/>
             </w:pPr>
             <w:r/>
@@ -600,18 +680,18 @@
         </w:tc>
         <w:tc>
           <w:tcPr>
-            <w:tcW w:type="dxa" w:w="3240"/>
+            <w:tcW w:type="dxa" w:w="3100"/>
             <w:vAlign w:val="center"/>
             <w:tcMar>
-              <w:top w:w="55" w:type="dxa"/>
-              <w:start w:w="55" w:type="dxa"/>
-              <w:bottom w:w="55" w:type="dxa"/>
-              <w:end w:w="55" w:type="dxa"/>
+              <w:top w:w="25" w:type="dxa"/>
+              <w:start w:w="45" w:type="dxa"/>
+              <w:bottom w:w="25" w:type="dxa"/>
+              <w:end w:w="45" w:type="dxa"/>
             </w:tcMar>
           </w:tcPr>
           <w:p>
             <w:pPr>
-              <w:spacing w:after="0" w:line="240" w:lineRule="auto"/>
+              <w:spacing w:after="0" w:line="240" w:lineRule="auto" w:before="0"/>
               <w:jc w:val="center"/>
             </w:pPr>
             <w:r/>
@@ -629,18 +709,18 @@
         </w:tc>
         <w:tc>
           <w:tcPr>
-            <w:tcW w:type="dxa" w:w="3557"/>
+            <w:tcW w:type="dxa" w:w="3826"/>
             <w:vAlign w:val="center"/>
             <w:tcMar>
-              <w:top w:w="55" w:type="dxa"/>
-              <w:start w:w="55" w:type="dxa"/>
-              <w:bottom w:w="55" w:type="dxa"/>
-              <w:end w:w="55" w:type="dxa"/>
+              <w:top w:w="25" w:type="dxa"/>
+              <w:start w:w="45" w:type="dxa"/>
+              <w:bottom w:w="25" w:type="dxa"/>
+              <w:end w:w="45" w:type="dxa"/>
             </w:tcMar>
           </w:tcPr>
           <w:p>
             <w:pPr>
-              <w:spacing w:after="0" w:line="240" w:lineRule="auto"/>
+              <w:spacing w:after="0" w:line="240" w:lineRule="auto" w:before="0"/>
               <w:jc w:val="center"/>
             </w:pPr>
             <w:r/>
@@ -666,13 +746,24 @@
       </w:pPr>
       <w:r>
         <w:rPr>
-          <w:rFonts w:ascii="Times New Roman" w:hAnsi="Times New Roman" w:eastAsia="Times New Roman"/>
+          <w:rFonts w:ascii="Times New Roman" w:hAnsi="Times New Roman"/>
           <w:b w:val="0"/>
           <w:i/>
           <w:color w:val="161616"/>
           <w:sz w:val="15"/>
         </w:rPr>
-        <w:t>*A 3-unit teaching load shall be retained for faculty with administrative designation. A faculty member may handle a maximum of two (2) projects at a time.</w:t>
+        <w:t>*a maximum of 3 units must be retained for each faculty with administrative assignment/local designation</w:t>
+      </w:r>
+      <w:r>
+        <w:rPr>
+          <w:rFonts w:ascii="Times New Roman" w:hAnsi="Times New Roman"/>
+          <w:b w:val="0"/>
+          <w:i/>
+          <w:color w:val="161616"/>
+          <w:sz w:val="15"/>
+        </w:rPr>
+        <w:br/>
+        <w:t>Note: maximum of two (2) projects at a time are allowed per faculty member</w:t>
       </w:r>
     </w:p>
     <w:p>
@@ -726,207 +817,214 @@
         <w:t>Congratulations!</w:t>
       </w:r>
     </w:p>
-    <w:tbl>
-      <w:tblPr>
-        <w:tblW w:type="auto" w:w="0"/>
-        <w:jc w:val="center"/>
-        <w:tblLayout w:type="fixed"/>
-        <w:tblLook w:firstColumn="1" w:firstRow="1" w:lastColumn="0" w:lastRow="0" w:noHBand="0" w:noVBand="1" w:val="04A0"/>
-      </w:tblPr>
-      <w:tblGrid>
-        <w:gridCol w:w="4968"/>
-        <w:gridCol w:w="5112"/>
-      </w:tblGrid>
-      <w:tr>
-        <w:tc>
-          <w:tcPr>
-            <w:tcW w:type="dxa" w:w="5083"/>
-            <w:tcMar>
-              <w:top w:w="0" w:type="dxa"/>
-              <w:start w:w="30" w:type="dxa"/>
-              <w:bottom w:w="0" w:type="dxa"/>
-              <w:end w:w="30" w:type="dxa"/>
-            </w:tcMar>
-          </w:tcPr>
-          <w:p>
-            <w:pPr>
-              <w:spacing w:after="240"/>
-            </w:pPr>
-            <w:r/>
-            <w:r>
-              <w:rPr>
-                <w:rFonts w:ascii="Times New Roman" w:hAnsi="Times New Roman" w:eastAsia="Times New Roman"/>
-                <w:b w:val="0"/>
-                <w:i w:val="0"/>
-                <w:color w:val="161616"/>
-                <w:sz w:val="17"/>
-              </w:rPr>
-              <w:t>Respectfully,</w:t>
-            </w:r>
-          </w:p>
-          <w:p>
-            <w:pPr>
-              <w:spacing w:after="0"/>
-            </w:pPr>
-            <w:r>
-              <w:rPr>
-                <w:rFonts w:ascii="Times New Roman" w:hAnsi="Times New Roman" w:eastAsia="Times New Roman"/>
-                <w:b/>
-                <w:i w:val="0"/>
-                <w:color w:val="161616"/>
-                <w:sz w:val="17"/>
-              </w:rPr>
-              <w:t>{{ISSUING_OFFICER_NAME}}</w:t>
-            </w:r>
-          </w:p>
-          <w:p>
-            <w:pPr>
-              <w:spacing w:after="0"/>
-            </w:pPr>
-            <w:r>
-              <w:rPr>
-                <w:rFonts w:ascii="Times New Roman" w:hAnsi="Times New Roman" w:eastAsia="Times New Roman"/>
-                <w:b w:val="0"/>
-                <w:i w:val="0"/>
-                <w:color w:val="161616"/>
-                <w:sz w:val="15"/>
-              </w:rPr>
-              <w:t>{{ISSUING_OFFICER_TITLE}}</w:t>
-            </w:r>
-          </w:p>
-          <w:p>
-            <w:r>
-              <w:rPr>
-                <w:rFonts w:ascii="Times New Roman" w:hAnsi="Times New Roman" w:eastAsia="Times New Roman"/>
-                <w:b w:val="0"/>
-                <w:i w:val="0"/>
-                <w:color w:val="161616"/>
-                <w:sz w:val="15"/>
-              </w:rPr>
-              <w:t>{{ISSUING_OFFICER_COMMITTEE_ROLE}}</w:t>
-            </w:r>
-          </w:p>
-        </w:tc>
-        <w:tc>
-          <w:tcPr>
-            <w:tcW w:type="dxa" w:w="5083"/>
-            <w:tcMar>
-              <w:top w:w="0" w:type="dxa"/>
-              <w:start w:w="30" w:type="dxa"/>
-              <w:bottom w:w="0" w:type="dxa"/>
-              <w:end w:w="30" w:type="dxa"/>
-            </w:tcMar>
-          </w:tcPr>
-          <w:p>
-            <w:pPr>
-              <w:spacing w:after="240"/>
-            </w:pPr>
-            <w:r/>
-            <w:r>
-              <w:rPr>
-                <w:rFonts w:ascii="Times New Roman" w:hAnsi="Times New Roman" w:eastAsia="Times New Roman"/>
-                <w:b w:val="0"/>
-                <w:i w:val="0"/>
-                <w:color w:val="161616"/>
-                <w:sz w:val="17"/>
-              </w:rPr>
-              <w:t>Checked and Verified by:</w:t>
-            </w:r>
-          </w:p>
-          <w:p>
-            <w:pPr>
-              <w:spacing w:after="0"/>
-            </w:pPr>
-            <w:r>
-              <w:rPr>
-                <w:rFonts w:ascii="Times New Roman" w:hAnsi="Times New Roman" w:eastAsia="Times New Roman"/>
-                <w:b/>
-                <w:i w:val="0"/>
-                <w:color w:val="161616"/>
-                <w:sz w:val="17"/>
-              </w:rPr>
-              <w:t>{{VERIFYING_OFFICER_NAME}}</w:t>
-            </w:r>
-          </w:p>
-          <w:p>
-            <w:pPr>
-              <w:spacing w:after="0"/>
-            </w:pPr>
-            <w:r>
-              <w:rPr>
-                <w:rFonts w:ascii="Times New Roman" w:hAnsi="Times New Roman" w:eastAsia="Times New Roman"/>
-                <w:b w:val="0"/>
-                <w:i w:val="0"/>
-                <w:color w:val="161616"/>
-                <w:sz w:val="15"/>
-              </w:rPr>
-              <w:t>{{VERIFYING_OFFICER_TITLE}}</w:t>
-            </w:r>
-          </w:p>
-          <w:p>
-            <w:r>
-              <w:rPr>
-                <w:rFonts w:ascii="Times New Roman" w:hAnsi="Times New Roman" w:eastAsia="Times New Roman"/>
-                <w:b w:val="0"/>
-                <w:i w:val="0"/>
-                <w:color w:val="161616"/>
-                <w:sz w:val="15"/>
-              </w:rPr>
-              <w:t>{{VERIFYING_OFFICER_COMMITTEE_ROLE}}</w:t>
-            </w:r>
-          </w:p>
-        </w:tc>
-      </w:tr>
-    </w:tbl>
     <w:p>
       <w:pPr>
-        <w:spacing w:before="100" w:after="0"/>
+        <w:keepNext/>
+        <w:spacing w:before="0" w:after="360" w:line="240" w:lineRule="auto"/>
+        <w:jc w:val="left"/>
       </w:pPr>
       <w:r>
         <w:rPr>
-          <w:rFonts w:ascii="Times New Roman" w:hAnsi="Times New Roman" w:eastAsia="Times New Roman"/>
+          <w:rFonts w:ascii="Times New Roman" w:hAnsi="Times New Roman"/>
+          <w:b w:val="0"/>
+          <w:i w:val="0"/>
+          <w:color w:val="161616"/>
+          <w:sz w:val="18"/>
+        </w:rPr>
+        <w:t>Respectfully,</w:t>
+      </w:r>
+    </w:p>
+    <w:p>
+      <w:pPr>
+        <w:keepNext/>
+        <w:spacing w:before="0" w:after="0" w:line="240" w:lineRule="auto"/>
+        <w:jc w:val="left"/>
+      </w:pPr>
+      <w:r>
+        <w:rPr>
+          <w:rFonts w:ascii="Times New Roman" w:hAnsi="Times New Roman"/>
+          <w:b/>
+          <w:i w:val="0"/>
+          <w:color w:val="161616"/>
+          <w:sz w:val="18"/>
+        </w:rPr>
+        <w:t>{{ISSUING_OFFICER_NAME}}</w:t>
+      </w:r>
+    </w:p>
+    <w:p>
+      <w:pPr>
+        <w:keepNext/>
+        <w:spacing w:before="0" w:after="0" w:line="240" w:lineRule="auto"/>
+        <w:jc w:val="left"/>
+      </w:pPr>
+      <w:r>
+        <w:rPr>
+          <w:rFonts w:ascii="Times New Roman" w:hAnsi="Times New Roman"/>
           <w:b w:val="0"/>
           <w:i w:val="0"/>
           <w:color w:val="161616"/>
           <w:sz w:val="17"/>
+        </w:rPr>
+        <w:t>{{ISSUING_OFFICER_TITLE}}</w:t>
+      </w:r>
+    </w:p>
+    <w:p>
+      <w:pPr>
+        <w:keepNext/>
+        <w:spacing w:before="0" w:after="0" w:line="240" w:lineRule="auto"/>
+        <w:jc w:val="left"/>
+      </w:pPr>
+      <w:r>
+        <w:rPr>
+          <w:rFonts w:ascii="Times New Roman" w:hAnsi="Times New Roman"/>
+          <w:b w:val="0"/>
+          <w:i w:val="0"/>
+          <w:color w:val="161616"/>
+          <w:sz w:val="17"/>
+        </w:rPr>
+        <w:t>{{ISSUING_OFFICER_COMMITTEE_ROLE}}</w:t>
+      </w:r>
+    </w:p>
+    <w:p>
+      <w:pPr>
+        <w:keepNext/>
+        <w:spacing w:before="240" w:after="360" w:line="240" w:lineRule="auto"/>
+        <w:jc w:val="left"/>
+      </w:pPr>
+      <w:r>
+        <w:rPr>
+          <w:rFonts w:ascii="Times New Roman" w:hAnsi="Times New Roman"/>
+          <w:b w:val="0"/>
+          <w:i w:val="0"/>
+          <w:color w:val="161616"/>
+          <w:sz w:val="18"/>
+        </w:rPr>
+        <w:t>Checked and Verified by:</w:t>
+      </w:r>
+    </w:p>
+    <w:p>
+      <w:pPr>
+        <w:keepNext/>
+        <w:spacing w:before="0" w:after="0" w:line="240" w:lineRule="auto"/>
+        <w:jc w:val="left"/>
+      </w:pPr>
+      <w:r>
+        <w:rPr>
+          <w:rFonts w:ascii="Times New Roman" w:hAnsi="Times New Roman"/>
+          <w:b/>
+          <w:i w:val="0"/>
+          <w:color w:val="161616"/>
+          <w:sz w:val="18"/>
+        </w:rPr>
+        <w:t>{{VERIFYING_OFFICER_NAME}}</w:t>
+      </w:r>
+    </w:p>
+    <w:p>
+      <w:pPr>
+        <w:keepNext/>
+        <w:spacing w:before="0" w:after="0" w:line="240" w:lineRule="auto"/>
+        <w:jc w:val="left"/>
+      </w:pPr>
+      <w:r>
+        <w:rPr>
+          <w:rFonts w:ascii="Times New Roman" w:hAnsi="Times New Roman"/>
+          <w:b w:val="0"/>
+          <w:i w:val="0"/>
+          <w:color w:val="161616"/>
+          <w:sz w:val="17"/>
+        </w:rPr>
+        <w:t>{{VERIFYING_OFFICER_TITLE}}</w:t>
+      </w:r>
+    </w:p>
+    <w:p>
+      <w:pPr>
+        <w:keepNext w:val="0"/>
+        <w:spacing w:before="0" w:after="0" w:line="240" w:lineRule="auto"/>
+        <w:jc w:val="left"/>
+      </w:pPr>
+      <w:r>
+        <w:rPr>
+          <w:rFonts w:ascii="Times New Roman" w:hAnsi="Times New Roman"/>
+          <w:b w:val="0"/>
+          <w:i w:val="0"/>
+          <w:color w:val="161616"/>
+          <w:sz w:val="17"/>
+        </w:rPr>
+        <w:t>{{VERIFYING_OFFICER_COMMITTEE_ROLE}}</w:t>
+      </w:r>
+    </w:p>
+    <w:p>
+      <w:pPr>
+        <w:keepNext/>
+        <w:spacing w:before="240" w:after="320" w:line="240" w:lineRule="auto"/>
+        <w:jc w:val="left"/>
+      </w:pPr>
+      <w:r>
+        <w:rPr>
+          <w:rFonts w:ascii="Times New Roman" w:hAnsi="Times New Roman"/>
+          <w:b w:val="0"/>
+          <w:i w:val="0"/>
+          <w:color w:val="161616"/>
+          <w:sz w:val="18"/>
         </w:rPr>
         <w:t>Conforme:</w:t>
       </w:r>
     </w:p>
     <w:p>
       <w:pPr>
-        <w:spacing w:before="160" w:after="0"/>
+        <w:keepNext/>
+        <w:spacing w:before="0" w:after="0" w:line="240" w:lineRule="auto"/>
+        <w:jc w:val="left"/>
       </w:pPr>
       <w:r>
         <w:rPr>
-          <w:rFonts w:ascii="Times New Roman" w:hAnsi="Times New Roman" w:eastAsia="Times New Roman"/>
+          <w:rFonts w:ascii="Times New Roman" w:hAnsi="Times New Roman"/>
           <w:b w:val="0"/>
           <w:i w:val="0"/>
           <w:color w:val="161616"/>
           <w:sz w:val="16"/>
         </w:rPr>
-        <w:t>________________________________________     ____________________</w:t>
+        <w:t>____________________________________________</w:t>
       </w:r>
     </w:p>
     <w:p>
       <w:pPr>
-        <w:spacing w:after="0"/>
+        <w:keepNext/>
+        <w:spacing w:after="0" w:before="0" w:line="240" w:lineRule="auto"/>
+        <w:ind w:left="893"/>
+        <w:jc w:val="left"/>
       </w:pPr>
       <w:r>
         <w:rPr>
-          <w:rFonts w:ascii="Times New Roman" w:hAnsi="Times New Roman" w:eastAsia="Times New Roman"/>
+          <w:rFonts w:ascii="Times New Roman" w:hAnsi="Times New Roman"/>
           <w:b w:val="0"/>
           <w:i w:val="0"/>
           <w:color w:val="161616"/>
-          <w:sz w:val="14"/>
+          <w:sz w:val="15"/>
         </w:rPr>
-        <w:t>Signature above printed name                                      Date</w:t>
+        <w:t>Signature above printed name</w:t>
+      </w:r>
+    </w:p>
+    <w:p>
+      <w:pPr>
+        <w:spacing w:before="0" w:after="0" w:line="240" w:lineRule="auto"/>
+        <w:jc w:val="left"/>
+      </w:pPr>
+      <w:r>
+        <w:rPr>
+          <w:rFonts w:ascii="Times New Roman" w:hAnsi="Times New Roman"/>
+          <w:b w:val="0"/>
+          <w:i w:val="0"/>
+          <w:color w:val="161616"/>
+          <w:sz w:val="18"/>
+        </w:rPr>
+        <w:t>Date:</w:t>
       </w:r>
     </w:p>
     <w:sectPr>
       <w:footerReference w:type="default" r:id="rId10"/>
       <w:pgSz w:w="12240" w:h="18720"/>
-      <w:pgMar w:top="605" w:right="1037" w:bottom="749" w:left="1037" w:header="216" w:footer="259" w:gutter="0"/>
+      <w:pgMar w:top="605" w:right="1037" w:bottom="749" w:left="1037" w:header="216" w:footer="648" w:gutter="0"/>
       <w:cols w:space="720"/>
       <w:docGrid w:linePitch="360"/>
     </w:sectPr>
@@ -939,7 +1037,7 @@
   <w:p>
     <w:pPr>
       <w:pStyle w:val="Footer"/>
-      <w:spacing w:after="0"/>
+      <w:spacing w:after="0" w:before="0"/>
       <w:jc w:val="center"/>
     </w:pPr>
     <w:r>
@@ -948,7 +1046,7 @@
         <w:b/>
         <w:i/>
         <w:color w:val="C8102E"/>
-        <w:sz w:val="16"/>
+        <w:sz w:val="18"/>
       </w:rPr>
       <w:t>Leading Innovations. Transforming Lives. Building the Nation.</w:t>
     </w:r>

</xml_diff>